<commit_message>
Upload project and report
</commit_message>
<xml_diff>
--- a/AoD_project_report_word_template_2025.docx
+++ b/AoD_project_report_word_template_2025.docx
@@ -1,6 +1,6 @@
 
 <file path=word/document.xml><?xml version="1.0" encoding="utf-8"?>
-<w:document xmlns:wpc="http://schemas.microsoft.com/office/word/2010/wordprocessingCanvas" xmlns:cx="http://schemas.microsoft.com/office/drawing/2014/chartex" xmlns:cx1="http://schemas.microsoft.com/office/drawing/2015/9/8/chartex" xmlns:cx2="http://schemas.microsoft.com/office/drawing/2015/10/21/chartex" xmlns:cx3="http://schemas.microsoft.com/office/drawing/2016/5/9/chartex" xmlns:cx4="http://schemas.microsoft.com/office/drawing/2016/5/10/chartex" xmlns:cx5="http://schemas.microsoft.com/office/drawing/2016/5/11/chartex" xmlns:cx6="http://schemas.microsoft.com/office/drawing/2016/5/12/chartex" xmlns:cx7="http://schemas.microsoft.com/office/drawing/2016/5/13/chartex" xmlns:cx8="http://schemas.microsoft.com/office/drawing/2016/5/14/chartex" xmlns:mc="http://schemas.openxmlformats.org/markup-compatibility/2006" xmlns:aink="http://schemas.microsoft.com/office/drawing/2016/ink" xmlns:am3d="http://schemas.microsoft.com/office/drawing/2017/model3d" xmlns:o="urn:schemas-microsoft-com:office:office" xmlns:oel="http://schemas.microsoft.com/office/2019/extlst" xmlns:r="http://schemas.openxmlformats.org/officeDocument/2006/relationships" xmlns:m="http://schemas.openxmlformats.org/officeDocument/2006/math" xmlns:v="urn:schemas-microsoft-com:vml" xmlns:wp14="http://schemas.microsoft.com/office/word/2010/wordprocessingDrawing" xmlns:wp="http://schemas.openxmlformats.org/drawingml/2006/wordprocessingDrawing" xmlns:w10="urn:schemas-microsoft-com:office:word" xmlns:w="http://schemas.openxmlformats.org/wordprocessingml/2006/main" xmlns:w14="http://schemas.microsoft.com/office/word/2010/wordml" xmlns:w15="http://schemas.microsoft.com/office/word/2012/wordml" xmlns:w16cex="http://schemas.microsoft.com/office/word/2018/wordml/cex" xmlns:w16cid="http://schemas.microsoft.com/office/word/2016/wordml/cid" xmlns:w16="http://schemas.microsoft.com/office/word/2018/wordml" xmlns:w16du="http://schemas.microsoft.com/office/word/2023/wordml/word16du" xmlns:w16sdtdh="http://schemas.microsoft.com/office/word/2020/wordml/sdtdatahash" xmlns:w16se="http://schemas.microsoft.com/office/word/2015/wordml/symex" xmlns:wpg="http://schemas.microsoft.com/office/word/2010/wordprocessingGroup" xmlns:wpi="http://schemas.microsoft.com/office/word/2010/wordprocessingInk" xmlns:wne="http://schemas.microsoft.com/office/word/2006/wordml" xmlns:wps="http://schemas.microsoft.com/office/word/2010/wordprocessingShape" mc:Ignorable="w14 w15 w16se w16cid w16 w16cex w16sdtdh w16du wp14">
+<w:document xmlns:wpc="http://schemas.microsoft.com/office/word/2010/wordprocessingCanvas" xmlns:cx="http://schemas.microsoft.com/office/drawing/2014/chartex" xmlns:cx1="http://schemas.microsoft.com/office/drawing/2015/9/8/chartex" xmlns:cx2="http://schemas.microsoft.com/office/drawing/2015/10/21/chartex" xmlns:cx3="http://schemas.microsoft.com/office/drawing/2016/5/9/chartex" xmlns:cx4="http://schemas.microsoft.com/office/drawing/2016/5/10/chartex" xmlns:cx5="http://schemas.microsoft.com/office/drawing/2016/5/11/chartex" xmlns:cx6="http://schemas.microsoft.com/office/drawing/2016/5/12/chartex" xmlns:cx7="http://schemas.microsoft.com/office/drawing/2016/5/13/chartex" xmlns:cx8="http://schemas.microsoft.com/office/drawing/2016/5/14/chartex" xmlns:mc="http://schemas.openxmlformats.org/markup-compatibility/2006" xmlns:aink="http://schemas.microsoft.com/office/drawing/2016/ink" xmlns:am3d="http://schemas.microsoft.com/office/drawing/2017/model3d" xmlns:o="urn:schemas-microsoft-com:office:office" xmlns:oel="http://schemas.microsoft.com/office/2019/extlst" xmlns:r="http://schemas.openxmlformats.org/officeDocument/2006/relationships" xmlns:m="http://schemas.openxmlformats.org/officeDocument/2006/math" xmlns:v="urn:schemas-microsoft-com:vml" xmlns:wp14="http://schemas.microsoft.com/office/word/2010/wordprocessingDrawing" xmlns:wp="http://schemas.openxmlformats.org/drawingml/2006/wordprocessingDrawing" xmlns:w10="urn:schemas-microsoft-com:office:word" xmlns:w="http://schemas.openxmlformats.org/wordprocessingml/2006/main" xmlns:w14="http://schemas.microsoft.com/office/word/2010/wordml" xmlns:w15="http://schemas.microsoft.com/office/word/2012/wordml" xmlns:w16cex="http://schemas.microsoft.com/office/word/2018/wordml/cex" xmlns:w16cid="http://schemas.microsoft.com/office/word/2016/wordml/cid" xmlns:w16="http://schemas.microsoft.com/office/word/2018/wordml" xmlns:w16du="http://schemas.microsoft.com/office/word/2023/wordml/word16du" xmlns:w16sdtdh="http://schemas.microsoft.com/office/word/2020/wordml/sdtdatahash" xmlns:w16sdtfl="http://schemas.microsoft.com/office/word/2024/wordml/sdtformatlock" xmlns:w16se="http://schemas.microsoft.com/office/word/2015/wordml/symex" xmlns:wpg="http://schemas.microsoft.com/office/word/2010/wordprocessingGroup" xmlns:wpi="http://schemas.microsoft.com/office/word/2010/wordprocessingInk" xmlns:wne="http://schemas.microsoft.com/office/word/2006/wordml" xmlns:wps="http://schemas.microsoft.com/office/word/2010/wordprocessingShape" mc:Ignorable="w14 w15 w16se w16cid w16 w16cex w16sdtdh w16sdtfl w16du wp14">
   <w:body>
     <w:p>
       <w:pPr>
@@ -504,7 +504,21 @@
         <w:rPr>
           <w:lang w:val="es-ES"/>
         </w:rPr>
-        <w:t xml:space="preserve"> Y O U R N A M E 3 , Y O U R N A M E 4 </w:t>
+        <w:t xml:space="preserve"> Y O U R N A M E </w:t>
+      </w:r>
+      <w:proofErr w:type="gramStart"/>
+      <w:r>
+        <w:rPr>
+          <w:lang w:val="es-ES"/>
+        </w:rPr>
+        <w:t>3 ,</w:t>
+      </w:r>
+      <w:proofErr w:type="gramEnd"/>
+      <w:r>
+        <w:rPr>
+          <w:lang w:val="es-ES"/>
+        </w:rPr>
+        <w:t xml:space="preserve"> Y O U R N A M E 4 </w:t>
       </w:r>
     </w:p>
     <w:p>
@@ -580,19 +594,11 @@
         </w:rPr>
         <w:t xml:space="preserve">dr. </w:t>
       </w:r>
-      <w:proofErr w:type="spellStart"/>
       <w:r>
         <w:rPr>
           <w:spacing w:val="-2"/>
         </w:rPr>
-        <w:t>Julija</w:t>
-      </w:r>
-      <w:proofErr w:type="spellEnd"/>
-      <w:r>
-        <w:rPr>
-          <w:spacing w:val="-2"/>
-        </w:rPr>
-        <w:t xml:space="preserve"> </w:t>
+        <w:t xml:space="preserve">Julija </w:t>
       </w:r>
       <w:proofErr w:type="spellStart"/>
       <w:r>
@@ -1232,10 +1238,24 @@
         <w:jc w:val="both"/>
       </w:pPr>
       <w:r>
-        <w:t>State problem definition here</w:t>
-      </w:r>
-      <w:r>
-        <w:t>.</w:t>
+        <w:t>Dodge the Mud is a free mobile game in which players attempt to avoid falling mud. This project focuses on predicting player churn using gameplay data collected from January 2015 to May 2016, consisting of 163,929 rows and three columns: device, score, and time. The time variable indicates the Unix Epoch timestamp for each gameplay session.</w:t>
+      </w:r>
+    </w:p>
+    <w:p>
+      <w:pPr>
+        <w:pStyle w:val="BodyText"/>
+        <w:spacing w:line="256" w:lineRule="auto"/>
+        <w:ind w:right="699"/>
+        <w:jc w:val="both"/>
+      </w:pPr>
+      <w:r>
+        <w:t xml:space="preserve">In the context of mobile games, churn refers to a player who permanently stops playing (Runge &amp; Gao, 2014). To construct reliable labels for churn and non-churn, </w:t>
+      </w:r>
+      <w:r>
+        <w:t>two-time</w:t>
+      </w:r>
+      <w:r>
+        <w:t xml:space="preserve"> windows are required: the Observation Period (OP) and the Churn Prediction Period (CP). The OP begins at the player’s first recorded session and continues for a defined number of days, during which the player’s early behavior is observed. The CP follows the OP and serves as the period for determining churn status. A player with at least one session within the CP is considered a non-churner, while the absence of activity classifies the player as a churner. These definitions form the foundation for building ground-truth labels.</w:t>
       </w:r>
     </w:p>
     <w:p>
@@ -1265,184 +1285,210 @@
     </w:p>
     <w:p>
       <w:pPr>
-        <w:pStyle w:val="BodyText"/>
-        <w:spacing w:before="7"/>
-        <w:rPr>
-          <w:sz w:val="25"/>
-        </w:rPr>
-      </w:pPr>
-    </w:p>
-    <w:p>
-      <w:pPr>
-        <w:tabs>
-          <w:tab w:val="right" w:pos="8342"/>
-        </w:tabs>
-        <w:spacing w:before="85"/>
-        <w:rPr>
-          <w:sz w:val="20"/>
-        </w:rPr>
-      </w:pPr>
-      <w:r>
-        <w:t>Describe the methodological approach here</w:t>
-      </w:r>
-      <w:r>
-        <w:rPr>
-          <w:sz w:val="20"/>
-        </w:rPr>
-        <w:t>.</w:t>
-      </w:r>
-    </w:p>
-    <w:p>
-      <w:pPr>
-        <w:pStyle w:val="BodyText"/>
-        <w:rPr>
-          <w:sz w:val="20"/>
-        </w:rPr>
-      </w:pPr>
-    </w:p>
-    <w:p>
-      <w:pPr>
-        <w:pStyle w:val="BodyText"/>
-        <w:rPr>
-          <w:sz w:val="20"/>
-        </w:rPr>
-      </w:pPr>
-    </w:p>
-    <w:p>
-      <w:pPr>
-        <w:pStyle w:val="BodyText"/>
-        <w:spacing w:before="5"/>
-        <w:rPr>
-          <w:lang w:val="en-NL"/>
-        </w:rPr>
-      </w:pPr>
-      <w:r>
-        <w:rPr>
-          <w:noProof/>
-          <w:lang w:val="en-NL"/>
-        </w:rPr>
-        <w:drawing>
-          <wp:inline distT="0" distB="0" distL="0" distR="0" wp14:anchorId="24354EF4" wp14:editId="0F5684A4">
-            <wp:extent cx="5429250" cy="2654300"/>
-            <wp:effectExtent l="0" t="0" r="0" b="0"/>
-            <wp:docPr id="1504552608" name="Picture 2" descr="A screenshot of a computer game&#10;&#10;Description automatically generated"/>
-            <wp:cNvGraphicFramePr>
-              <a:graphicFrameLocks xmlns:a="http://schemas.openxmlformats.org/drawingml/2006/main" noChangeAspect="1"/>
-            </wp:cNvGraphicFramePr>
-            <a:graphic xmlns:a="http://schemas.openxmlformats.org/drawingml/2006/main">
-              <a:graphicData uri="http://schemas.openxmlformats.org/drawingml/2006/picture">
-                <pic:pic xmlns:pic="http://schemas.openxmlformats.org/drawingml/2006/picture">
-                  <pic:nvPicPr>
-                    <pic:cNvPr id="1504552608" name="Picture 2" descr="A screenshot of a computer game&#10;&#10;Description automatically generated"/>
-                    <pic:cNvPicPr>
-                      <a:picLocks noChangeAspect="1" noChangeArrowheads="1"/>
-                    </pic:cNvPicPr>
-                  </pic:nvPicPr>
-                  <pic:blipFill>
-                    <a:blip r:embed="rId17">
-                      <a:extLst>
-                        <a:ext uri="{28A0092B-C50C-407E-A947-70E740481C1C}">
-                          <a14:useLocalDpi xmlns:a14="http://schemas.microsoft.com/office/drawing/2010/main" val="0"/>
-                        </a:ext>
-                      </a:extLst>
-                    </a:blip>
-                    <a:srcRect/>
-                    <a:stretch>
-                      <a:fillRect/>
-                    </a:stretch>
-                  </pic:blipFill>
-                  <pic:spPr bwMode="auto">
-                    <a:xfrm>
-                      <a:off x="0" y="0"/>
-                      <a:ext cx="5429250" cy="2654300"/>
-                    </a:xfrm>
-                    <a:prstGeom prst="rect">
-                      <a:avLst/>
-                    </a:prstGeom>
-                    <a:noFill/>
-                    <a:ln>
-                      <a:noFill/>
-                    </a:ln>
-                  </pic:spPr>
-                </pic:pic>
-              </a:graphicData>
-            </a:graphic>
-          </wp:inline>
-        </w:drawing>
-      </w:r>
-    </w:p>
-    <w:p>
-      <w:pPr>
-        <w:pStyle w:val="BodyText"/>
-        <w:spacing w:before="5"/>
-        <w:rPr>
-          <w:sz w:val="35"/>
-        </w:rPr>
-      </w:pPr>
-    </w:p>
-    <w:p>
-      <w:pPr>
-        <w:ind w:right="180"/>
-        <w:jc w:val="center"/>
-        <w:rPr>
-          <w:sz w:val="20"/>
-        </w:rPr>
-      </w:pPr>
-      <w:bookmarkStart w:id="3" w:name="_bookmark1"/>
-      <w:bookmarkEnd w:id="3"/>
-      <w:r>
-        <w:rPr>
-          <w:sz w:val="20"/>
-        </w:rPr>
-        <w:t>Figure</w:t>
-      </w:r>
-      <w:r>
-        <w:rPr>
-          <w:spacing w:val="10"/>
-          <w:sz w:val="20"/>
-        </w:rPr>
-        <w:t xml:space="preserve"> </w:t>
-      </w:r>
-      <w:r>
-        <w:rPr>
-          <w:sz w:val="20"/>
-        </w:rPr>
-        <w:t>1:</w:t>
-      </w:r>
-      <w:r>
-        <w:rPr>
-          <w:spacing w:val="25"/>
-          <w:sz w:val="20"/>
-        </w:rPr>
-        <w:t xml:space="preserve"> </w:t>
-      </w:r>
-      <w:r>
-        <w:rPr>
-          <w:sz w:val="20"/>
-        </w:rPr>
-        <w:t>Visual depiction of defining the Observation Period and the Churn Prediction Period</w:t>
-      </w:r>
-      <w:r>
-        <w:rPr>
-          <w:sz w:val="20"/>
-        </w:rPr>
-        <w:t>.</w:t>
-      </w:r>
-      <w:r>
-        <w:rPr>
-          <w:spacing w:val="25"/>
-          <w:sz w:val="20"/>
-        </w:rPr>
-        <w:t xml:space="preserve"> </w:t>
-      </w:r>
-    </w:p>
-    <w:p>
-      <w:pPr>
         <w:spacing w:line="284" w:lineRule="exact"/>
         <w:jc w:val="both"/>
       </w:pPr>
+      <w:bookmarkStart w:id="3" w:name="_bookmark1"/>
       <w:bookmarkStart w:id="4" w:name="Method"/>
+      <w:bookmarkEnd w:id="3"/>
       <w:bookmarkEnd w:id="4"/>
+      <w:r>
+        <w:t>Our methodological approach is as follows:</w:t>
+      </w:r>
+    </w:p>
+    <w:p>
+      <w:pPr>
+        <w:spacing w:line="284" w:lineRule="exact"/>
+        <w:jc w:val="both"/>
+      </w:pPr>
+      <w:r>
+        <w:t>2.1 Preprocessing data</w:t>
+      </w:r>
+    </w:p>
+    <w:p>
+      <w:pPr>
+        <w:spacing w:line="284" w:lineRule="exact"/>
+        <w:jc w:val="both"/>
+      </w:pPr>
+      <w:r>
+        <w:t>Before building predictive models, it was necessary to convert timestamps into standard datetime format and examine the dataset in detail. Only nine observations contained missing device IDs, which represented a negligible portion of the dataset and were therefore removed. Exploratory data analysis included investigations of player lifetimes, retention rates, score patterns, and session behavior. These insights informed the selection of OP and CP windows and guided the subsequent feature engineering process.</w:t>
+      </w:r>
+    </w:p>
+    <w:p>
+      <w:pPr>
+        <w:spacing w:line="284" w:lineRule="exact"/>
+        <w:jc w:val="both"/>
+      </w:pPr>
+      <w:r>
+        <w:t xml:space="preserve">2.2 </w:t>
+      </w:r>
+      <w:r>
+        <w:t>Create churn/no-churn label</w:t>
+      </w:r>
+    </w:p>
+    <w:p>
+      <w:pPr>
+        <w:spacing w:line="284" w:lineRule="exact"/>
+        <w:jc w:val="both"/>
+      </w:pPr>
+      <w:r>
+        <w:t xml:space="preserve">The choice of OP and CP lengths plays a critical role in defining meaningful churn labels. </w:t>
+      </w:r>
+      <w:r>
+        <w:t>L</w:t>
+      </w:r>
+      <w:r>
+        <w:t>ong windows risk misclassifying genuine churners, whereas overly short windows may incorrectly label players who take short breaks. Based on behavioral analysis of gameplay patterns, several OP/CP configurations were tested to determine appropriate labeling schemes.</w:t>
+      </w:r>
+    </w:p>
+    <w:p>
+      <w:pPr>
+        <w:spacing w:line="284" w:lineRule="exact"/>
+        <w:jc w:val="both"/>
+      </w:pPr>
+    </w:p>
+    <w:p>
+      <w:pPr>
+        <w:spacing w:line="284" w:lineRule="exact"/>
+        <w:jc w:val="both"/>
+      </w:pPr>
+      <w:r>
+        <w:t>2.3 Feature engineering</w:t>
+      </w:r>
+    </w:p>
+    <w:p>
+      <w:pPr>
+        <w:spacing w:line="284" w:lineRule="exact"/>
+        <w:jc w:val="both"/>
+      </w:pPr>
+      <w:r>
+        <w:t>Feature engineering focused on capturing early player behavior during the OP. Both basic and advanced behavioral features were created, including session counts, score statistics, and measures of engagement. In total, 34 features were generated.</w:t>
+      </w:r>
+    </w:p>
+    <w:p>
+      <w:pPr>
+        <w:spacing w:line="284" w:lineRule="exact"/>
+        <w:jc w:val="both"/>
+      </w:pPr>
+      <w:r>
+        <w:t xml:space="preserve">Feature selection proceeded through several stages. Low-variance filtering showed that all features exceeded the 1% variance threshold. Correlation analysis identified 13 feature pairs </w:t>
+      </w:r>
+      <w:r>
+        <w:lastRenderedPageBreak/>
+        <w:t xml:space="preserve">with correlations above 0.9; features with lower importance (based on Random Forest rankings) were removed from these pairs. </w:t>
+      </w:r>
+    </w:p>
+    <w:p>
+      <w:pPr>
+        <w:spacing w:line="284" w:lineRule="exact"/>
+        <w:jc w:val="both"/>
+      </w:pPr>
+      <w:r>
+        <w:t>2.4 Models training</w:t>
+      </w:r>
+    </w:p>
+    <w:p>
+      <w:pPr>
+        <w:spacing w:line="284" w:lineRule="exact"/>
+        <w:jc w:val="both"/>
+      </w:pPr>
+      <w:r>
+        <w:t>The dataset exhibited substantial class imbalance. For OP = 7 and CP = 14, churners accounted for 93% of the labeled data. Applying SMOTE to the entire dataset would produce excessive synthetic samples, potentially distorting the true data distribution. To mitigate this issue, SMOTE was applied to only half of the data, yielding a more balanced distribution of 60% churn vs. 40% non-churn.</w:t>
+      </w:r>
+    </w:p>
+    <w:p>
+      <w:pPr>
+        <w:spacing w:line="284" w:lineRule="exact"/>
+        <w:jc w:val="both"/>
+      </w:pPr>
+      <w:r>
+        <w:t xml:space="preserve">The data was then split into training and test sets, and models were evaluated using five-fold cross-validation. Three models were selected for training: Random Forest, </w:t>
+      </w:r>
+      <w:proofErr w:type="spellStart"/>
+      <w:r>
+        <w:t>XGBoost</w:t>
+      </w:r>
+      <w:proofErr w:type="spellEnd"/>
+      <w:r>
+        <w:t xml:space="preserve">, and </w:t>
+      </w:r>
+      <w:proofErr w:type="spellStart"/>
+      <w:r>
+        <w:t>CatBoost</w:t>
+      </w:r>
+      <w:proofErr w:type="spellEnd"/>
+      <w:r>
+        <w:t>. These models were chosen due to their strong performance on tabular data and their ability to capture non-linear relationships.</w:t>
+      </w:r>
+    </w:p>
+    <w:p>
+      <w:pPr>
+        <w:spacing w:line="284" w:lineRule="exact"/>
+        <w:jc w:val="both"/>
+      </w:pPr>
+      <w:r>
+        <w:t>2.5 Test OP/CP Combination</w:t>
+      </w:r>
+    </w:p>
+    <w:p>
+      <w:pPr>
+        <w:spacing w:line="284" w:lineRule="exact"/>
+        <w:jc w:val="both"/>
+      </w:pPr>
+      <w:r>
+        <w:t>To determine a suitable combination of OP and CP, several configurations ranging from (OP = 1, CP = 3) to (OP = 7, CP = 14) were evaluated using stratified five-fold cross-validation with cost-sensitive learning. The configuration (OP = 7, CP = 7) achieved the best results, with a ROC-AUC of 0.792 and a PR-AUC of 0.979, while maintaining a dataset of 25,956 samples and capturing 95% of true churners.</w:t>
+      </w:r>
+    </w:p>
+    <w:p>
+      <w:pPr>
+        <w:spacing w:line="284" w:lineRule="exact"/>
+        <w:jc w:val="both"/>
+      </w:pPr>
+      <w:r>
+        <w:t>Although this configuration produced the strongest metrics, it also resulted in an extremely imbalanced dataset, where 95% of players were labeled as churners. Such imbalance can inflate performance artificially by allowing models to predict the majority class. Therefore, the second-best configuration, OP = 7 and CP = 14, was selected because it offered strong performance while maintaining a more realistic class distribution.</w:t>
+      </w:r>
+    </w:p>
+    <w:p>
+      <w:pPr>
+        <w:spacing w:line="284" w:lineRule="exact"/>
+        <w:jc w:val="both"/>
+      </w:pPr>
+      <w:r>
+        <w:t>2.5. Hyperparameter Tuning</w:t>
+      </w:r>
+    </w:p>
+    <w:p>
+      <w:pPr>
+        <w:spacing w:line="284" w:lineRule="exact"/>
+        <w:jc w:val="both"/>
+      </w:pPr>
+      <w:r>
+        <w:t>Each model underwent hyperparameter optimization using randomized search approaches. The tuning process prioritized ROC-AUC and PR-AUC as the primary metrics due to the imbalanced nature of the dataset.</w:t>
+      </w:r>
+    </w:p>
+    <w:p>
+      <w:pPr>
+        <w:spacing w:line="284" w:lineRule="exact"/>
+        <w:jc w:val="both"/>
+      </w:pPr>
+      <w:r>
+        <w:t>2.6 Evaluation</w:t>
+      </w:r>
+      <w:r>
+        <w:t xml:space="preserve"> and</w:t>
+      </w:r>
+      <w:r>
+        <w:t xml:space="preserve"> Error Analysis</w:t>
+      </w:r>
+    </w:p>
+    <w:p>
+      <w:pPr>
+        <w:spacing w:line="284" w:lineRule="exact"/>
+        <w:jc w:val="both"/>
+      </w:pPr>
+      <w:r>
+        <w:t>Model evaluation considered accuracy, precision, recall, F1-score, ROC-AUC, and PR-AUC. Error analysis showed that most misclassifications occurred among borderline cases, particularly players with minimal or inconsistent activity during the CP.</w:t>
+      </w:r>
     </w:p>
     <w:p>
       <w:pPr>
@@ -1468,13 +1514,31 @@
     </w:p>
     <w:p>
       <w:r>
-        <w:t>Report your results here</w:t>
-      </w:r>
-      <w:r>
-        <w:t>.</w:t>
-      </w:r>
-    </w:p>
-    <w:p/>
+        <w:t>Random Forest achieved an accuracy of 0.941452, a precision of 0.950408, a recall of 0.962389, an F1-score of 0.956361, a ROC-AUC of 0.975839, and a PR-AUC of 0.984786.</w:t>
+      </w:r>
+      <w:r>
+        <w:br/>
+      </w:r>
+      <w:proofErr w:type="spellStart"/>
+      <w:r>
+        <w:t>XGBoost</w:t>
+      </w:r>
+      <w:proofErr w:type="spellEnd"/>
+      <w:r>
+        <w:t xml:space="preserve"> achieved an accuracy of 0.951095, a precision of 0.955876, a recall of 0.971482, an F1-score of 0.963616, a ROC-AUC of 0.975531, and a PR-AUC of 0.980715.</w:t>
+      </w:r>
+      <w:r>
+        <w:br/>
+      </w:r>
+      <w:proofErr w:type="spellStart"/>
+      <w:r>
+        <w:t>CatBoost</w:t>
+      </w:r>
+      <w:proofErr w:type="spellEnd"/>
+      <w:r>
+        <w:t xml:space="preserve"> achieved an accuracy of 0.953024, a precision of 0.961997, a recall of 0.967762, an F1-score of 0.964871, a ROC-AUC of 0.975458, and a PR-AUC of 0.980830.</w:t>
+      </w:r>
+    </w:p>
     <w:p>
       <w:pPr>
         <w:tabs>
@@ -1518,16 +1582,63 @@
         <w:spacing w:before="7"/>
       </w:pPr>
       <w:r>
-        <w:t>Provide a</w:t>
-      </w:r>
-      <w:r>
-        <w:t xml:space="preserve"> critical discussion and reflection of the obtained results</w:t>
-      </w:r>
-      <w:r>
-        <w:t xml:space="preserve"> here</w:t>
-      </w:r>
-      <w:r>
-        <w:t>.</w:t>
+        <w:t xml:space="preserve">The results demonstrate that early player behavior in </w:t>
+      </w:r>
+      <w:r>
+        <w:rPr>
+          <w:i/>
+          <w:iCs/>
+        </w:rPr>
+        <w:t>Dodge the Mud</w:t>
+      </w:r>
+      <w:r>
+        <w:t xml:space="preserve"> provides a strong basis for predicting long-term churn. </w:t>
+      </w:r>
+      <w:proofErr w:type="spellStart"/>
+      <w:r>
+        <w:t>CatBoost</w:t>
+      </w:r>
+      <w:proofErr w:type="spellEnd"/>
+      <w:r>
+        <w:t xml:space="preserve"> emerged as the best-performing model, which aligns with its strength in handling complex interactions and categorical features. However, Random Forest and </w:t>
+      </w:r>
+      <w:proofErr w:type="spellStart"/>
+      <w:r>
+        <w:t>XGBoost</w:t>
+      </w:r>
+      <w:proofErr w:type="spellEnd"/>
+      <w:r>
+        <w:t xml:space="preserve"> also delivered high performance, indicating that the problem is well suited to tree-based ensemble methods.</w:t>
+      </w:r>
+    </w:p>
+    <w:p>
+      <w:pPr>
+        <w:pStyle w:val="BodyText"/>
+        <w:spacing w:before="7"/>
+      </w:pPr>
+      <w:r>
+        <w:t>The main methodological challenge involved addressing the extreme class imbalance inherent in many OP/CP combinations. The choice of OP = 7 and CP = 14 offered an effective balance between performance and label reliability. This experiment highlights the importance of thoughtful window selection in churn prediction tasks, as labeling strategies directly influence both model behavior and interpretability.</w:t>
+      </w:r>
+    </w:p>
+    <w:p>
+      <w:pPr>
+        <w:pStyle w:val="BodyText"/>
+        <w:spacing w:before="7"/>
+      </w:pPr>
+      <w:r>
+        <w:t xml:space="preserve">Feature engineering also played a critical role. While </w:t>
+      </w:r>
+      <w:proofErr w:type="gramStart"/>
+      <w:r>
+        <w:t>a large number of</w:t>
+      </w:r>
+      <w:proofErr w:type="gramEnd"/>
+      <w:r>
+        <w:t xml:space="preserve"> features were initially </w:t>
+      </w:r>
+      <w:r>
+        <w:lastRenderedPageBreak/>
+        <w:t>created, only a small subset contributed meaningfully to model performance, demonstrating that player behavior during the early stages of the game is relatively simple and can be captured effectively by a compact set of features.</w:t>
       </w:r>
     </w:p>
     <w:p>
@@ -1552,7 +1663,6 @@
       <w:bookmarkEnd w:id="6"/>
       <w:bookmarkEnd w:id="7"/>
       <w:r>
-        <w:lastRenderedPageBreak/>
         <w:t>C</w:t>
       </w:r>
       <w:r>
@@ -1563,27 +1673,17 @@
       <w:pPr>
         <w:pStyle w:val="BodyText"/>
         <w:spacing w:before="6"/>
-        <w:rPr>
-          <w:sz w:val="27"/>
-        </w:rPr>
-      </w:pPr>
-      <w:r>
-        <w:t>State</w:t>
-      </w:r>
-      <w:r>
-        <w:t xml:space="preserve"> concise conclusions </w:t>
-      </w:r>
-      <w:r>
-        <w:t>as</w:t>
-      </w:r>
-      <w:r>
-        <w:t xml:space="preserve"> drawn from the discussion</w:t>
-      </w:r>
-      <w:r>
-        <w:t xml:space="preserve"> here</w:t>
-      </w:r>
-      <w:r>
-        <w:t>.</w:t>
+      </w:pPr>
+      <w:r>
+        <w:t xml:space="preserve">This study successfully developed a predictive model for identifying player churn in Dodge the Mud. After evaluating several OP/CP configurations, mitigating class imbalance, engineering relevant features, and testing multiple tree-based models, </w:t>
+      </w:r>
+      <w:proofErr w:type="spellStart"/>
+      <w:r>
+        <w:t>CatBoost</w:t>
+      </w:r>
+      <w:proofErr w:type="spellEnd"/>
+      <w:r>
+        <w:t xml:space="preserve"> demonstrated the best overall performance. The findings show that player activity within the first seven days is highly informative for predicting future churn and that careful design of labeling windows is crucial for building robust churn prediction models. These insights can support game designers in developing more effective retention strategies and tailoring interventions for at-risk players.</w:t>
       </w:r>
     </w:p>
     <w:p>
@@ -1692,6 +1792,32 @@
       <w:r>
         <w:t xml:space="preserve"> where applicable.</w:t>
       </w:r>
+      <w:r>
+        <w:br/>
+      </w:r>
+      <w:r>
+        <w:t xml:space="preserve">Code (Preprocess, EDA, Train models): </w:t>
+      </w:r>
+      <w:r>
+        <w:t>Le Anh Thu Pham</w:t>
+      </w:r>
+      <w:r>
+        <w:br/>
+        <w:t xml:space="preserve">Code (Hyperparameter tuning, OP/CP comparison, Feature importance): </w:t>
+      </w:r>
+      <w:r>
+        <w:t>Lam Minh Triet Thien</w:t>
+      </w:r>
+      <w:r>
+        <w:br/>
+        <w:t xml:space="preserve">Writing </w:t>
+      </w:r>
+      <w:r>
+        <w:t xml:space="preserve">(Problem statements, methodology): </w:t>
+      </w:r>
+      <w:r>
+        <w:t>Lam Minh Triet Thien</w:t>
+      </w:r>
     </w:p>
     <w:p>
       <w:pPr>
@@ -1701,42 +1827,10 @@
         <w:spacing w:before="85"/>
       </w:pPr>
       <w:r>
-        <w:t>Conceptualization: Member 1, Member 2, …</w:t>
-      </w:r>
-      <w:r>
-        <w:br/>
-        <w:t xml:space="preserve">Methodology: </w:t>
-      </w:r>
-      <w:r>
-        <w:t>Member 1, Member 2, …</w:t>
-      </w:r>
-      <w:r>
-        <w:br/>
-        <w:t xml:space="preserve">Analysis: </w:t>
-      </w:r>
-      <w:r>
-        <w:t>Member 1, Member 2, …</w:t>
-      </w:r>
-      <w:r>
-        <w:br/>
-        <w:t xml:space="preserve">Writing – Original Draft: </w:t>
-      </w:r>
-      <w:r>
-        <w:t>Member 1, Member 2, …</w:t>
-      </w:r>
-      <w:r>
-        <w:br/>
-        <w:t xml:space="preserve">Writing – Review &amp; Editing: </w:t>
-      </w:r>
-      <w:r>
-        <w:t>Member 1, Member 2, …</w:t>
-      </w:r>
-      <w:r>
-        <w:br/>
-        <w:t xml:space="preserve">Visualization: </w:t>
-      </w:r>
-      <w:r>
-        <w:t>Member 1, Member 2, …</w:t>
+        <w:t>Writing (Results, Discussion, Conclusion</w:t>
+      </w:r>
+      <w:r>
+        <w:t>): Le Anh Thu Pham</w:t>
       </w:r>
     </w:p>
     <w:p>
@@ -1755,6 +1849,52 @@
       <w:r>
         <w:t>, and what you used them for).</w:t>
       </w:r>
+    </w:p>
+    <w:p>
+      <w:pPr>
+        <w:pStyle w:val="ListParagraph"/>
+        <w:numPr>
+          <w:ilvl w:val="0"/>
+          <w:numId w:val="10"/>
+        </w:numPr>
+        <w:tabs>
+          <w:tab w:val="left" w:pos="8242"/>
+        </w:tabs>
+        <w:spacing w:before="85"/>
+      </w:pPr>
+      <w:r>
+        <w:t>Use Claude to make some visualizations better, to clean the code</w:t>
+      </w:r>
+      <w:r>
+        <w:t>, fix bug.</w:t>
+      </w:r>
+    </w:p>
+    <w:p>
+      <w:pPr>
+        <w:pStyle w:val="ListParagraph"/>
+        <w:numPr>
+          <w:ilvl w:val="0"/>
+          <w:numId w:val="10"/>
+        </w:numPr>
+        <w:tabs>
+          <w:tab w:val="left" w:pos="8242"/>
+        </w:tabs>
+        <w:spacing w:before="85"/>
+      </w:pPr>
+      <w:r>
+        <w:t>Use ChatGPT to suggest methods to handle the class imbalance, and we tried different methods and went with SMOTE for half dataset</w:t>
+      </w:r>
+    </w:p>
+    <w:p>
+      <w:pPr>
+        <w:tabs>
+          <w:tab w:val="left" w:pos="8242"/>
+        </w:tabs>
+        <w:spacing w:before="85"/>
+        <w:rPr>
+          <w:lang w:val="vi-VN"/>
+        </w:rPr>
+      </w:pPr>
     </w:p>
     <w:sectPr>
       <w:pgSz w:w="11910" w:h="16840"/>
@@ -1766,7 +1906,7 @@
 </file>
 
 <file path=word/numbering.xml><?xml version="1.0" encoding="utf-8"?>
-<w:numbering xmlns:wpc="http://schemas.microsoft.com/office/word/2010/wordprocessingCanvas" xmlns:cx="http://schemas.microsoft.com/office/drawing/2014/chartex" xmlns:cx1="http://schemas.microsoft.com/office/drawing/2015/9/8/chartex" xmlns:cx2="http://schemas.microsoft.com/office/drawing/2015/10/21/chartex" xmlns:cx3="http://schemas.microsoft.com/office/drawing/2016/5/9/chartex" xmlns:cx4="http://schemas.microsoft.com/office/drawing/2016/5/10/chartex" xmlns:cx5="http://schemas.microsoft.com/office/drawing/2016/5/11/chartex" xmlns:cx6="http://schemas.microsoft.com/office/drawing/2016/5/12/chartex" xmlns:cx7="http://schemas.microsoft.com/office/drawing/2016/5/13/chartex" xmlns:cx8="http://schemas.microsoft.com/office/drawing/2016/5/14/chartex" xmlns:mc="http://schemas.openxmlformats.org/markup-compatibility/2006" xmlns:aink="http://schemas.microsoft.com/office/drawing/2016/ink" xmlns:am3d="http://schemas.microsoft.com/office/drawing/2017/model3d" xmlns:o="urn:schemas-microsoft-com:office:office" xmlns:oel="http://schemas.microsoft.com/office/2019/extlst" xmlns:r="http://schemas.openxmlformats.org/officeDocument/2006/relationships" xmlns:m="http://schemas.openxmlformats.org/officeDocument/2006/math" xmlns:v="urn:schemas-microsoft-com:vml" xmlns:wp14="http://schemas.microsoft.com/office/word/2010/wordprocessingDrawing" xmlns:wp="http://schemas.openxmlformats.org/drawingml/2006/wordprocessingDrawing" xmlns:w10="urn:schemas-microsoft-com:office:word" xmlns:w="http://schemas.openxmlformats.org/wordprocessingml/2006/main" xmlns:w14="http://schemas.microsoft.com/office/word/2010/wordml" xmlns:w15="http://schemas.microsoft.com/office/word/2012/wordml" xmlns:w16cex="http://schemas.microsoft.com/office/word/2018/wordml/cex" xmlns:w16cid="http://schemas.microsoft.com/office/word/2016/wordml/cid" xmlns:w16="http://schemas.microsoft.com/office/word/2018/wordml" xmlns:w16du="http://schemas.microsoft.com/office/word/2023/wordml/word16du" xmlns:w16sdtdh="http://schemas.microsoft.com/office/word/2020/wordml/sdtdatahash" xmlns:w16se="http://schemas.microsoft.com/office/word/2015/wordml/symex" xmlns:wpg="http://schemas.microsoft.com/office/word/2010/wordprocessingGroup" xmlns:wpi="http://schemas.microsoft.com/office/word/2010/wordprocessingInk" xmlns:wne="http://schemas.microsoft.com/office/word/2006/wordml" xmlns:wps="http://schemas.microsoft.com/office/word/2010/wordprocessingShape" mc:Ignorable="w14 w15 w16se w16cid w16 w16cex w16sdtdh w16du wp14">
+<w:numbering xmlns:wpc="http://schemas.microsoft.com/office/word/2010/wordprocessingCanvas" xmlns:cx="http://schemas.microsoft.com/office/drawing/2014/chartex" xmlns:cx1="http://schemas.microsoft.com/office/drawing/2015/9/8/chartex" xmlns:cx2="http://schemas.microsoft.com/office/drawing/2015/10/21/chartex" xmlns:cx3="http://schemas.microsoft.com/office/drawing/2016/5/9/chartex" xmlns:cx4="http://schemas.microsoft.com/office/drawing/2016/5/10/chartex" xmlns:cx5="http://schemas.microsoft.com/office/drawing/2016/5/11/chartex" xmlns:cx6="http://schemas.microsoft.com/office/drawing/2016/5/12/chartex" xmlns:cx7="http://schemas.microsoft.com/office/drawing/2016/5/13/chartex" xmlns:cx8="http://schemas.microsoft.com/office/drawing/2016/5/14/chartex" xmlns:mc="http://schemas.openxmlformats.org/markup-compatibility/2006" xmlns:aink="http://schemas.microsoft.com/office/drawing/2016/ink" xmlns:am3d="http://schemas.microsoft.com/office/drawing/2017/model3d" xmlns:o="urn:schemas-microsoft-com:office:office" xmlns:oel="http://schemas.microsoft.com/office/2019/extlst" xmlns:r="http://schemas.openxmlformats.org/officeDocument/2006/relationships" xmlns:m="http://schemas.openxmlformats.org/officeDocument/2006/math" xmlns:v="urn:schemas-microsoft-com:vml" xmlns:wp14="http://schemas.microsoft.com/office/word/2010/wordprocessingDrawing" xmlns:wp="http://schemas.openxmlformats.org/drawingml/2006/wordprocessingDrawing" xmlns:w10="urn:schemas-microsoft-com:office:word" xmlns:w="http://schemas.openxmlformats.org/wordprocessingml/2006/main" xmlns:w14="http://schemas.microsoft.com/office/word/2010/wordml" xmlns:w15="http://schemas.microsoft.com/office/word/2012/wordml" xmlns:w16cex="http://schemas.microsoft.com/office/word/2018/wordml/cex" xmlns:w16cid="http://schemas.microsoft.com/office/word/2016/wordml/cid" xmlns:w16="http://schemas.microsoft.com/office/word/2018/wordml" xmlns:w16du="http://schemas.microsoft.com/office/word/2023/wordml/word16du" xmlns:w16sdtdh="http://schemas.microsoft.com/office/word/2020/wordml/sdtdatahash" xmlns:w16sdtfl="http://schemas.microsoft.com/office/word/2024/wordml/sdtformatlock" xmlns:w16se="http://schemas.microsoft.com/office/word/2015/wordml/symex" xmlns:wpg="http://schemas.microsoft.com/office/word/2010/wordprocessingGroup" xmlns:wpi="http://schemas.microsoft.com/office/word/2010/wordprocessingInk" xmlns:wne="http://schemas.microsoft.com/office/word/2006/wordml" xmlns:wps="http://schemas.microsoft.com/office/word/2010/wordprocessingShape" mc:Ignorable="w14 w15 w16se w16cid w16 w16cex w16sdtdh w16sdtfl w16du wp14">
   <w:abstractNum w:abstractNumId="0" w15:restartNumberingAfterBreak="0">
     <w:nsid w:val="176706CD"/>
     <w:multiLevelType w:val="multilevel"/>
@@ -2795,6 +2935,119 @@
       </w:pPr>
       <w:rPr>
         <w:rFonts w:hint="default"/>
+      </w:rPr>
+    </w:lvl>
+  </w:abstractNum>
+  <w:abstractNum w:abstractNumId="9" w15:restartNumberingAfterBreak="0">
+    <w:nsid w:val="79A046D7"/>
+    <w:multiLevelType w:val="hybridMultilevel"/>
+    <w:tmpl w:val="62188646"/>
+    <w:lvl w:ilvl="0" w:tplc="E49A74CE">
+      <w:start w:val="2"/>
+      <w:numFmt w:val="bullet"/>
+      <w:lvlText w:val="-"/>
+      <w:lvlJc w:val="left"/>
+      <w:pPr>
+        <w:ind w:left="720" w:hanging="360"/>
+      </w:pPr>
+      <w:rPr>
+        <w:rFonts w:ascii="Times New Roman" w:eastAsia="Times New Roman" w:hAnsi="Times New Roman" w:cs="Times New Roman" w:hint="default"/>
+      </w:rPr>
+    </w:lvl>
+    <w:lvl w:ilvl="1" w:tplc="04090003" w:tentative="1">
+      <w:start w:val="1"/>
+      <w:numFmt w:val="bullet"/>
+      <w:lvlText w:val="o"/>
+      <w:lvlJc w:val="left"/>
+      <w:pPr>
+        <w:ind w:left="1440" w:hanging="360"/>
+      </w:pPr>
+      <w:rPr>
+        <w:rFonts w:ascii="Courier New" w:hAnsi="Courier New" w:cs="Courier New" w:hint="default"/>
+      </w:rPr>
+    </w:lvl>
+    <w:lvl w:ilvl="2" w:tplc="04090005" w:tentative="1">
+      <w:start w:val="1"/>
+      <w:numFmt w:val="bullet"/>
+      <w:lvlText w:val=""/>
+      <w:lvlJc w:val="left"/>
+      <w:pPr>
+        <w:ind w:left="2160" w:hanging="360"/>
+      </w:pPr>
+      <w:rPr>
+        <w:rFonts w:ascii="Wingdings" w:hAnsi="Wingdings" w:hint="default"/>
+      </w:rPr>
+    </w:lvl>
+    <w:lvl w:ilvl="3" w:tplc="04090001" w:tentative="1">
+      <w:start w:val="1"/>
+      <w:numFmt w:val="bullet"/>
+      <w:lvlText w:val=""/>
+      <w:lvlJc w:val="left"/>
+      <w:pPr>
+        <w:ind w:left="2880" w:hanging="360"/>
+      </w:pPr>
+      <w:rPr>
+        <w:rFonts w:ascii="Symbol" w:hAnsi="Symbol" w:hint="default"/>
+      </w:rPr>
+    </w:lvl>
+    <w:lvl w:ilvl="4" w:tplc="04090003" w:tentative="1">
+      <w:start w:val="1"/>
+      <w:numFmt w:val="bullet"/>
+      <w:lvlText w:val="o"/>
+      <w:lvlJc w:val="left"/>
+      <w:pPr>
+        <w:ind w:left="3600" w:hanging="360"/>
+      </w:pPr>
+      <w:rPr>
+        <w:rFonts w:ascii="Courier New" w:hAnsi="Courier New" w:cs="Courier New" w:hint="default"/>
+      </w:rPr>
+    </w:lvl>
+    <w:lvl w:ilvl="5" w:tplc="04090005" w:tentative="1">
+      <w:start w:val="1"/>
+      <w:numFmt w:val="bullet"/>
+      <w:lvlText w:val=""/>
+      <w:lvlJc w:val="left"/>
+      <w:pPr>
+        <w:ind w:left="4320" w:hanging="360"/>
+      </w:pPr>
+      <w:rPr>
+        <w:rFonts w:ascii="Wingdings" w:hAnsi="Wingdings" w:hint="default"/>
+      </w:rPr>
+    </w:lvl>
+    <w:lvl w:ilvl="6" w:tplc="04090001" w:tentative="1">
+      <w:start w:val="1"/>
+      <w:numFmt w:val="bullet"/>
+      <w:lvlText w:val=""/>
+      <w:lvlJc w:val="left"/>
+      <w:pPr>
+        <w:ind w:left="5040" w:hanging="360"/>
+      </w:pPr>
+      <w:rPr>
+        <w:rFonts w:ascii="Symbol" w:hAnsi="Symbol" w:hint="default"/>
+      </w:rPr>
+    </w:lvl>
+    <w:lvl w:ilvl="7" w:tplc="04090003" w:tentative="1">
+      <w:start w:val="1"/>
+      <w:numFmt w:val="bullet"/>
+      <w:lvlText w:val="o"/>
+      <w:lvlJc w:val="left"/>
+      <w:pPr>
+        <w:ind w:left="5760" w:hanging="360"/>
+      </w:pPr>
+      <w:rPr>
+        <w:rFonts w:ascii="Courier New" w:hAnsi="Courier New" w:cs="Courier New" w:hint="default"/>
+      </w:rPr>
+    </w:lvl>
+    <w:lvl w:ilvl="8" w:tplc="04090005" w:tentative="1">
+      <w:start w:val="1"/>
+      <w:numFmt w:val="bullet"/>
+      <w:lvlText w:val=""/>
+      <w:lvlJc w:val="left"/>
+      <w:pPr>
+        <w:ind w:left="6480" w:hanging="360"/>
+      </w:pPr>
+      <w:rPr>
+        <w:rFonts w:ascii="Wingdings" w:hAnsi="Wingdings" w:hint="default"/>
       </w:rPr>
     </w:lvl>
   </w:abstractNum>
@@ -2825,11 +3078,14 @@
   <w:num w:numId="9" w16cid:durableId="2100523941">
     <w:abstractNumId w:val="1"/>
   </w:num>
+  <w:num w:numId="10" w16cid:durableId="459884437">
+    <w:abstractNumId w:val="9"/>
+  </w:num>
 </w:numbering>
 </file>
 
 <file path=word/styles.xml><?xml version="1.0" encoding="utf-8"?>
-<w:styles xmlns:mc="http://schemas.openxmlformats.org/markup-compatibility/2006" xmlns:r="http://schemas.openxmlformats.org/officeDocument/2006/relationships" xmlns:w="http://schemas.openxmlformats.org/wordprocessingml/2006/main" xmlns:w14="http://schemas.microsoft.com/office/word/2010/wordml" xmlns:w15="http://schemas.microsoft.com/office/word/2012/wordml" xmlns:w16cex="http://schemas.microsoft.com/office/word/2018/wordml/cex" xmlns:w16cid="http://schemas.microsoft.com/office/word/2016/wordml/cid" xmlns:w16="http://schemas.microsoft.com/office/word/2018/wordml" xmlns:w16du="http://schemas.microsoft.com/office/word/2023/wordml/word16du" xmlns:w16sdtdh="http://schemas.microsoft.com/office/word/2020/wordml/sdtdatahash" xmlns:w16se="http://schemas.microsoft.com/office/word/2015/wordml/symex" mc:Ignorable="w14 w15 w16se w16cid w16 w16cex w16sdtdh w16du">
+<w:styles xmlns:mc="http://schemas.openxmlformats.org/markup-compatibility/2006" xmlns:r="http://schemas.openxmlformats.org/officeDocument/2006/relationships" xmlns:w="http://schemas.openxmlformats.org/wordprocessingml/2006/main" xmlns:w14="http://schemas.microsoft.com/office/word/2010/wordml" xmlns:w15="http://schemas.microsoft.com/office/word/2012/wordml" xmlns:w16cex="http://schemas.microsoft.com/office/word/2018/wordml/cex" xmlns:w16cid="http://schemas.microsoft.com/office/word/2016/wordml/cid" xmlns:w16="http://schemas.microsoft.com/office/word/2018/wordml" xmlns:w16du="http://schemas.microsoft.com/office/word/2023/wordml/word16du" xmlns:w16sdtdh="http://schemas.microsoft.com/office/word/2020/wordml/sdtdatahash" xmlns:w16sdtfl="http://schemas.microsoft.com/office/word/2024/wordml/sdtformatlock" xmlns:w16se="http://schemas.microsoft.com/office/word/2015/wordml/symex" mc:Ignorable="w14 w15 w16se w16cid w16 w16cex w16sdtdh w16sdtfl w16du">
   <w:docDefaults>
     <w:rPrDefault>
       <w:rPr>
@@ -3257,7 +3513,6 @@
   <w:style w:type="character" w:default="1" w:styleId="DefaultParagraphFont">
     <w:name w:val="Default Paragraph Font"/>
     <w:uiPriority w:val="1"/>
-    <w:semiHidden/>
     <w:unhideWhenUsed/>
   </w:style>
   <w:style w:type="table" w:default="1" w:styleId="TableNormal">
@@ -3699,27 +3954,6 @@
 </file>
 
 <file path=customXml/item1.xml><?xml version="1.0" encoding="utf-8"?>
-<?mso-contentType ?>
-<FormTemplates xmlns="http://schemas.microsoft.com/sharepoint/v3/contenttype/forms">
-  <Display>DocumentLibraryForm</Display>
-  <Edit>DocumentLibraryForm</Edit>
-  <New>DocumentLibraryForm</New>
-</FormTemplates>
-</file>
-
-<file path=customXml/item2.xml><?xml version="1.0" encoding="utf-8"?>
-<p:properties xmlns:p="http://schemas.microsoft.com/office/2006/metadata/properties" xmlns:xsi="http://www.w3.org/2001/XMLSchema-instance" xmlns:pc="http://schemas.microsoft.com/office/infopath/2007/PartnerControls">
-  <documentManagement>
-    <Comment xmlns="8e8f327f-1239-4f04-8aab-a0b5f064d2d7" xsi:nil="true"/>
-    <TaxCatchAll xmlns="4247e884-9c05-420e-9e4b-e2608af499a5" xsi:nil="true"/>
-    <lcf76f155ced4ddcb4097134ff3c332f xmlns="8e8f327f-1239-4f04-8aab-a0b5f064d2d7">
-      <Terms xmlns="http://schemas.microsoft.com/office/infopath/2007/PartnerControls"/>
-    </lcf76f155ced4ddcb4097134ff3c332f>
-  </documentManagement>
-</p:properties>
-</file>
-
-<file path=customXml/item3.xml><?xml version="1.0" encoding="utf-8"?>
 <ct:contentTypeSchema xmlns:ct="http://schemas.microsoft.com/office/2006/metadata/contentType" xmlns:ma="http://schemas.microsoft.com/office/2006/metadata/properties/metaAttributes" ct:_="" ma:_="" ma:contentTypeName="Document" ma:contentTypeID="0x0101001AD7C0C58448824F91D59496D38A2A0B" ma:contentTypeVersion="17" ma:contentTypeDescription="Create a new document." ma:contentTypeScope="" ma:versionID="28bf453467d3355b5953af0661544b3d">
   <xsd:schema xmlns:xsd="http://www.w3.org/2001/XMLSchema" xmlns:xs="http://www.w3.org/2001/XMLSchema" xmlns:p="http://schemas.microsoft.com/office/2006/metadata/properties" xmlns:ns2="8e8f327f-1239-4f04-8aab-a0b5f064d2d7" xmlns:ns3="4247e884-9c05-420e-9e4b-e2608af499a5" targetNamespace="http://schemas.microsoft.com/office/2006/metadata/properties" ma:root="true" ma:fieldsID="efe5d1aa3a3334392d3059ffab070c0c" ns2:_="" ns3:_="">
     <xsd:import namespace="8e8f327f-1239-4f04-8aab-a0b5f064d2d7"/>
@@ -3970,10 +4204,42 @@
 </ct:contentTypeSchema>
 </file>
 
+<file path=customXml/item2.xml><?xml version="1.0" encoding="utf-8"?>
+<p:properties xmlns:p="http://schemas.microsoft.com/office/2006/metadata/properties" xmlns:xsi="http://www.w3.org/2001/XMLSchema-instance" xmlns:pc="http://schemas.microsoft.com/office/infopath/2007/PartnerControls">
+  <documentManagement>
+    <Comment xmlns="8e8f327f-1239-4f04-8aab-a0b5f064d2d7" xsi:nil="true"/>
+    <TaxCatchAll xmlns="4247e884-9c05-420e-9e4b-e2608af499a5" xsi:nil="true"/>
+    <lcf76f155ced4ddcb4097134ff3c332f xmlns="8e8f327f-1239-4f04-8aab-a0b5f064d2d7">
+      <Terms xmlns="http://schemas.microsoft.com/office/infopath/2007/PartnerControls"/>
+    </lcf76f155ced4ddcb4097134ff3c332f>
+  </documentManagement>
+</p:properties>
+</file>
+
+<file path=customXml/item3.xml><?xml version="1.0" encoding="utf-8"?>
+<?mso-contentType ?>
+<FormTemplates xmlns="http://schemas.microsoft.com/sharepoint/v3/contenttype/forms">
+  <Display>DocumentLibraryForm</Display>
+  <Edit>DocumentLibraryForm</Edit>
+  <New>DocumentLibraryForm</New>
+</FormTemplates>
+</file>
+
 <file path=customXml/itemProps1.xml><?xml version="1.0" encoding="utf-8"?>
-<ds:datastoreItem xmlns:ds="http://schemas.openxmlformats.org/officeDocument/2006/customXml" ds:itemID="{B1BEB7B5-53E0-4B6E-9410-B2BBEADCDD9D}">
+<ds:datastoreItem xmlns:ds="http://schemas.openxmlformats.org/officeDocument/2006/customXml" ds:itemID="{F06F9DDB-F6EB-4F4A-A84E-F250AD49F628}">
   <ds:schemaRefs>
-    <ds:schemaRef ds:uri="http://schemas.microsoft.com/sharepoint/v3/contenttype/forms"/>
+    <ds:schemaRef ds:uri="http://schemas.microsoft.com/office/2006/metadata/contentType"/>
+    <ds:schemaRef ds:uri="http://schemas.microsoft.com/office/2006/metadata/properties/metaAttributes"/>
+    <ds:schemaRef ds:uri="http://www.w3.org/2001/XMLSchema"/>
+    <ds:schemaRef ds:uri="http://schemas.microsoft.com/office/2006/metadata/properties"/>
+    <ds:schemaRef ds:uri="8e8f327f-1239-4f04-8aab-a0b5f064d2d7"/>
+    <ds:schemaRef ds:uri="4247e884-9c05-420e-9e4b-e2608af499a5"/>
+    <ds:schemaRef ds:uri="http://schemas.microsoft.com/office/2006/documentManagement/types"/>
+    <ds:schemaRef ds:uri="http://schemas.microsoft.com/office/infopath/2007/PartnerControls"/>
+    <ds:schemaRef ds:uri="http://schemas.openxmlformats.org/package/2006/metadata/core-properties"/>
+    <ds:schemaRef ds:uri="http://purl.org/dc/elements/1.1/"/>
+    <ds:schemaRef ds:uri="http://purl.org/dc/terms/"/>
+    <ds:schemaRef ds:uri="http://schemas.microsoft.com/internal/obd"/>
   </ds:schemaRefs>
 </ds:datastoreItem>
 </file>
@@ -3990,20 +4256,9 @@
 </file>
 
 <file path=customXml/itemProps3.xml><?xml version="1.0" encoding="utf-8"?>
-<ds:datastoreItem xmlns:ds="http://schemas.openxmlformats.org/officeDocument/2006/customXml" ds:itemID="{F06F9DDB-F6EB-4F4A-A84E-F250AD49F628}">
+<ds:datastoreItem xmlns:ds="http://schemas.openxmlformats.org/officeDocument/2006/customXml" ds:itemID="{B1BEB7B5-53E0-4B6E-9410-B2BBEADCDD9D}">
   <ds:schemaRefs>
-    <ds:schemaRef ds:uri="http://schemas.microsoft.com/office/2006/metadata/contentType"/>
-    <ds:schemaRef ds:uri="http://schemas.microsoft.com/office/2006/metadata/properties/metaAttributes"/>
-    <ds:schemaRef ds:uri="http://www.w3.org/2001/XMLSchema"/>
-    <ds:schemaRef ds:uri="http://schemas.microsoft.com/office/2006/metadata/properties"/>
-    <ds:schemaRef ds:uri="8e8f327f-1239-4f04-8aab-a0b5f064d2d7"/>
-    <ds:schemaRef ds:uri="4247e884-9c05-420e-9e4b-e2608af499a5"/>
-    <ds:schemaRef ds:uri="http://schemas.microsoft.com/office/2006/documentManagement/types"/>
-    <ds:schemaRef ds:uri="http://schemas.microsoft.com/office/infopath/2007/PartnerControls"/>
-    <ds:schemaRef ds:uri="http://schemas.openxmlformats.org/package/2006/metadata/core-properties"/>
-    <ds:schemaRef ds:uri="http://purl.org/dc/elements/1.1/"/>
-    <ds:schemaRef ds:uri="http://purl.org/dc/terms/"/>
-    <ds:schemaRef ds:uri="http://schemas.microsoft.com/internal/obd"/>
+    <ds:schemaRef ds:uri="http://schemas.microsoft.com/sharepoint/v3/contenttype/forms"/>
   </ds:schemaRefs>
 </ds:datastoreItem>
 </file>
</xml_diff>